<commit_message>
Lisans veritabanina tasindi; Ayarlar ekraninda lisans karti
</commit_message>
<xml_diff>
--- a/docs/MIYOP-Urunlesme-Yol-Haritasi.docx
+++ b/docs/MIYOP-Urunlesme-Yol-Haritasi.docx
@@ -147,7 +147,7 @@
           <w:sz w:val="19"/>
           <w:szCs w:val="19"/>
         </w:rPr>
-        <w:t>Aşamalar sırayla yapılır; atlanamaz. Her aşama kendi testleriyle biter. A4B yasal ve operasyonel açıkları, A4C ise firmanın her gün yaşadığı sipariş kaosunu kapatır.</w:t>
+        <w:t>Aşamalar sırayla yapılır; atlanamaz. Her aşama kendi testleriyle biter. A4D kapıyı açar: başvurudan ilk girişe kadar. A4C firmanın her gün yaşadığı sipariş kaosunu, A4B ise yasal ve operasyonel açıkları kapatır. 2026-09-22 kararıyla sıra A4 → A4D → A4C → A4B → A5 oldu: önce yanan yeri söndürüyoruz. (Belgede A4B bölümü A4C’den önce yazılmıştır; geçerli sıra yukarıdaki tablodur.)</w:t>
       </w:r>
     </w:p>
     <w:tbl>
@@ -936,7 +936,7 @@
                 <w:sz w:val="19"/>
                 <w:szCs w:val="19"/>
               </w:rPr>
-              <w:t>A4B</w:t>
+              <w:t xml:space="preserve">A4D</w:t>
             </w:r>
           </w:p>
         </w:tc>
@@ -964,7 +964,7 @@
                 <w:sz w:val="19"/>
                 <w:szCs w:val="19"/>
               </w:rPr>
-              <w:t>Endüstriyel mutfak tamamlama</w:t>
+              <w:t xml:space="preserve">Kapı · başvuru ve hesap</w:t>
             </w:r>
           </w:p>
         </w:tc>
@@ -990,7 +990,7 @@
                 <w:sz w:val="18"/>
                 <w:szCs w:val="18"/>
               </w:rPr>
-              <w:t>Araç ve şoför, sefer sıcaklığı, ürün etiketi, alerjen, şube kapsamı</w:t>
+              <w:t xml:space="preserve">Başvuru, onay, Auth hesabı, davet e-postası, şifre belirleme, izolasyon</w:t>
             </w:r>
           </w:p>
         </w:tc>
@@ -1013,11 +1013,10 @@
           <w:p>
             <w:r>
               <w:rPr>
-                <w:color w:val="6A716A"/>
                 <w:sz w:val="18"/>
                 <w:szCs w:val="18"/>
               </w:rPr>
-              <w:t>Fabrikanın kendi diliyle konuşan ürün</w:t>
+              <w:t xml:space="preserve">1 hafta · 11/12 bitti</w:t>
             </w:r>
           </w:p>
         </w:tc>
@@ -1137,6 +1136,125 @@
                 <w:szCs w:val="18"/>
               </w:rPr>
               <w:t>Firmanın her gün yaşadığı acı çözülür</w:t>
+            </w:r>
+          </w:p>
+        </w:tc>
+      </w:tr>
+      <w:tr>
+        <w:tblPrEx>
+          <w:tblCellMar>
+            <w:top w:w="0" w:type="dxa"/>
+            <w:bottom w:w="0" w:type="dxa"/>
+          </w:tblCellMar>
+        </w:tblPrEx>
+        <w:tc>
+          <w:tcPr>
+            <w:tcW w:w="760" w:type="dxa"/>
+            <w:tcBorders>
+              <w:top w:val="single" w:sz="4" w:space="0" w:color="D5D9D3"/>
+              <w:left w:val="single" w:sz="4" w:space="0" w:color="D5D9D3"/>
+              <w:bottom w:val="single" w:sz="4" w:space="0" w:color="D5D9D3"/>
+              <w:right w:val="single" w:sz="4" w:space="0" w:color="D5D9D3"/>
+            </w:tcBorders>
+            <w:tcMar>
+              <w:top w:w="90" w:type="dxa"/>
+              <w:left w:w="120" w:type="dxa"/>
+              <w:bottom w:w="90" w:type="dxa"/>
+              <w:right w:w="120" w:type="dxa"/>
+            </w:tcMar>
+          </w:tcPr>
+          <w:p>
+            <w:r>
+              <w:rPr>
+                <w:rFonts w:ascii="Consolas" w:eastAsia="Consolas" w:hAnsi="Consolas" w:cs="Consolas"/>
+                <w:b/>
+                <w:bCs/>
+                <w:color w:val="0B5F56"/>
+                <w:sz w:val="19"/>
+                <w:szCs w:val="19"/>
+              </w:rPr>
+              <w:t>A4B</w:t>
+            </w:r>
+          </w:p>
+        </w:tc>
+        <w:tc>
+          <w:tcPr>
+            <w:tcW w:w="2340" w:type="dxa"/>
+            <w:tcBorders>
+              <w:top w:val="single" w:sz="4" w:space="0" w:color="D5D9D3"/>
+              <w:left w:val="single" w:sz="4" w:space="0" w:color="D5D9D3"/>
+              <w:bottom w:val="single" w:sz="4" w:space="0" w:color="D5D9D3"/>
+              <w:right w:val="single" w:sz="4" w:space="0" w:color="D5D9D3"/>
+            </w:tcBorders>
+            <w:tcMar>
+              <w:top w:w="90" w:type="dxa"/>
+              <w:left w:w="120" w:type="dxa"/>
+              <w:bottom w:w="90" w:type="dxa"/>
+              <w:right w:w="120" w:type="dxa"/>
+            </w:tcMar>
+          </w:tcPr>
+          <w:p>
+            <w:r>
+              <w:rPr>
+                <w:b/>
+                <w:bCs/>
+                <w:sz w:val="19"/>
+                <w:szCs w:val="19"/>
+              </w:rPr>
+              <w:t>Endüstriyel mutfak tamamlama</w:t>
+            </w:r>
+          </w:p>
+        </w:tc>
+        <w:tc>
+          <w:tcPr>
+            <w:tcW w:w="3600" w:type="dxa"/>
+            <w:tcBorders>
+              <w:top w:val="single" w:sz="4" w:space="0" w:color="D5D9D3"/>
+              <w:left w:val="single" w:sz="4" w:space="0" w:color="D5D9D3"/>
+              <w:bottom w:val="single" w:sz="4" w:space="0" w:color="D5D9D3"/>
+              <w:right w:val="single" w:sz="4" w:space="0" w:color="D5D9D3"/>
+            </w:tcBorders>
+            <w:tcMar>
+              <w:top w:w="90" w:type="dxa"/>
+              <w:left w:w="120" w:type="dxa"/>
+              <w:bottom w:w="90" w:type="dxa"/>
+              <w:right w:w="120" w:type="dxa"/>
+            </w:tcMar>
+          </w:tcPr>
+          <w:p>
+            <w:r>
+              <w:rPr>
+                <w:sz w:val="18"/>
+                <w:szCs w:val="18"/>
+              </w:rPr>
+              <w:t>Araç ve şoför, sefer sıcaklığı, ürün etiketi, alerjen, şube kapsamı</w:t>
+            </w:r>
+          </w:p>
+        </w:tc>
+        <w:tc>
+          <w:tcPr>
+            <w:tcW w:w="2300" w:type="dxa"/>
+            <w:tcBorders>
+              <w:top w:val="single" w:sz="4" w:space="0" w:color="D5D9D3"/>
+              <w:left w:val="single" w:sz="4" w:space="0" w:color="D5D9D3"/>
+              <w:bottom w:val="single" w:sz="4" w:space="0" w:color="D5D9D3"/>
+              <w:right w:val="single" w:sz="4" w:space="0" w:color="D5D9D3"/>
+            </w:tcBorders>
+            <w:tcMar>
+              <w:top w:w="90" w:type="dxa"/>
+              <w:left w:w="120" w:type="dxa"/>
+              <w:bottom w:w="90" w:type="dxa"/>
+              <w:right w:w="120" w:type="dxa"/>
+            </w:tcMar>
+          </w:tcPr>
+          <w:p>
+            <w:r>
+              <w:rPr>
+                <w:color w:val="6A716A"/>
+                <w:sz w:val="18"/>
+                <w:szCs w:val="18"/>
+              </w:rPr>
+              <w:t>Fabrikanın kendi diliyle konuşan ürün</w:t>
             </w:r>
           </w:p>
         </w:tc>
@@ -7535,7 +7653,7 @@
                 <w:sz w:val="24"/>
                 <w:szCs w:val="24"/>
               </w:rPr>
-              <w:t>☐</w:t>
+              <w:t>☑</w:t>
             </w:r>
           </w:p>
         </w:tc>
@@ -7627,7 +7745,7 @@
                 <w:sz w:val="24"/>
                 <w:szCs w:val="24"/>
               </w:rPr>
-              <w:t>☐</w:t>
+              <w:t>☑</w:t>
             </w:r>
           </w:p>
         </w:tc>
@@ -7719,7 +7837,7 @@
                 <w:sz w:val="24"/>
                 <w:szCs w:val="24"/>
               </w:rPr>
-              <w:t>☐</w:t>
+              <w:t>☑</w:t>
             </w:r>
           </w:p>
         </w:tc>
@@ -7811,7 +7929,7 @@
                 <w:sz w:val="24"/>
                 <w:szCs w:val="24"/>
               </w:rPr>
-              <w:t>☐</w:t>
+              <w:t>☑</w:t>
             </w:r>
           </w:p>
         </w:tc>
@@ -7903,7 +8021,7 @@
                 <w:sz w:val="24"/>
                 <w:szCs w:val="24"/>
               </w:rPr>
-              <w:t>☐</w:t>
+              <w:t>☑</w:t>
             </w:r>
           </w:p>
         </w:tc>
@@ -7995,7 +8113,7 @@
                 <w:sz w:val="24"/>
                 <w:szCs w:val="24"/>
               </w:rPr>
-              <w:t>☐</w:t>
+              <w:t>☑</w:t>
             </w:r>
           </w:p>
         </w:tc>
@@ -8179,7 +8297,7 @@
                 <w:sz w:val="24"/>
                 <w:szCs w:val="24"/>
               </w:rPr>
-              <w:t>☐</w:t>
+              <w:t>☑</w:t>
             </w:r>
           </w:p>
         </w:tc>
@@ -8363,7 +8481,7 @@
                 <w:sz w:val="24"/>
                 <w:szCs w:val="24"/>
               </w:rPr>
-              <w:t>☐</w:t>
+              <w:t>☑</w:t>
             </w:r>
           </w:p>
         </w:tc>
@@ -8503,6 +8621,1274 @@
       <w:r>
         <w:br w:type="page"/>
       </w:r>
+    </w:p>
+    <w:p>
+      <w:pPr>
+        <w:spacing w:after="60"/>
+      </w:pPr>
+      <w:r>
+        <w:rPr>
+          <w:rFonts w:ascii="Consolas" w:eastAsia="Consolas" w:hAnsi="Consolas" w:cs="Consolas"/>
+          <w:b/>
+          <w:bCs/>
+          <w:color w:val="0B5F56"/>
+          <w:spacing w:val="30"/>
+          <w:sz w:val="15"/>
+          <w:szCs w:val="15"/>
+        </w:rPr>
+        <w:t xml:space="preserve">AŞAMA 4D</w:t>
+      </w:r>
+    </w:p>
+    <w:p>
+      <w:pPr>
+        <w:pStyle w:val="Balk1"/>
+        <w:spacing w:before="360" w:after="160"/>
+      </w:pPr>
+      <w:r>
+        <w:rPr>
+          <w:b/>
+          <w:bCs/>
+          <w:color w:val="1B1E1B"/>
+        </w:rPr>
+        <w:t xml:space="preserve">Kapı: başvuru → onay → hesap → giriş</w:t>
+      </w:r>
+    </w:p>
+    <w:p>
+      <w:pPr>
+        <w:spacing w:after="160" w:line="264" w:lineRule="auto"/>
+      </w:pPr>
+      <w:r>
+        <w:rPr>
+          <w:color w:val="6A716A"/>
+          <w:sz w:val="19"/>
+          <w:szCs w:val="19"/>
+        </w:rPr>
+        <w:t xml:space="preserve">Demonun birinci perdesi. Müşteri Evren360’ta başvurur, Emrah onaylar, işletme açılır, davet e-postası gider, müşteri şifresini kendisi belirler ve kendi çalışma alanına girer. Bir demoda ilk görülen şeyin en riskli parça olması kabul edilemez; bu yüzden risk öne alındı ve bu aşama A4’ten hemen sonra yapıldı.</w:t>
+      </w:r>
+    </w:p>
+    <w:tbl>
+      <w:tblPr>
+        <w:tblW w:w="9000" w:type="dxa"/>
+        <w:tblBorders>
+          <w:top w:val="single" w:sz="4" w:space="0" w:color="auto"/>
+          <w:left w:val="single" w:sz="4" w:space="0" w:color="auto"/>
+          <w:bottom w:val="single" w:sz="4" w:space="0" w:color="auto"/>
+          <w:right w:val="single" w:sz="4" w:space="0" w:color="auto"/>
+          <w:insideH w:val="single" w:sz="4" w:space="0" w:color="auto"/>
+          <w:insideV w:val="single" w:sz="4" w:space="0" w:color="auto"/>
+        </w:tblBorders>
+        <w:tblCellMar>
+          <w:left w:w="10" w:type="dxa"/>
+          <w:right w:w="10" w:type="dxa"/>
+        </w:tblCellMar>
+        <w:tblLook w:val="0000" w:firstRow="0" w:lastRow="0" w:firstColumn="0" w:lastColumn="0" w:noHBand="0" w:noVBand="0"/>
+      </w:tblPr>
+      <w:tblGrid>
+        <w:gridCol w:w="520"/>
+        <w:gridCol w:w="5180"/>
+        <w:gridCol w:w="3300"/>
+      </w:tblGrid>
+      <w:tr>
+        <w:tblPrEx>
+          <w:tblCellMar>
+            <w:top w:w="0" w:type="dxa"/>
+            <w:bottom w:w="0" w:type="dxa"/>
+          </w:tblCellMar>
+        </w:tblPrEx>
+        <w:trPr>
+          <w:tblHeader/>
+        </w:trPr>
+        <w:tc>
+          <w:tcPr>
+            <w:tcW w:w="520" w:type="dxa"/>
+            <w:tcBorders>
+              <w:top w:val="single" w:sz="4" w:space="0" w:color="D5D9D3"/>
+              <w:left w:val="single" w:sz="4" w:space="0" w:color="D5D9D3"/>
+              <w:bottom w:val="single" w:sz="4" w:space="0" w:color="D5D9D3"/>
+              <w:right w:val="single" w:sz="4" w:space="0" w:color="D5D9D3"/>
+            </w:tcBorders>
+            <w:shd w:val="clear" w:color="auto" w:fill="E4E8E4"/>
+            <w:tcMar>
+              <w:top w:w="90" w:type="dxa"/>
+              <w:left w:w="120" w:type="dxa"/>
+              <w:bottom w:w="90" w:type="dxa"/>
+              <w:right w:w="120" w:type="dxa"/>
+            </w:tcMar>
+          </w:tcPr>
+          <w:p/>
+        </w:tc>
+        <w:tc>
+          <w:tcPr>
+            <w:tcW w:w="5180" w:type="dxa"/>
+            <w:tcBorders>
+              <w:top w:val="single" w:sz="4" w:space="0" w:color="D5D9D3"/>
+              <w:left w:val="single" w:sz="4" w:space="0" w:color="D5D9D3"/>
+              <w:bottom w:val="single" w:sz="4" w:space="0" w:color="D5D9D3"/>
+              <w:right w:val="single" w:sz="4" w:space="0" w:color="D5D9D3"/>
+            </w:tcBorders>
+            <w:shd w:val="clear" w:color="auto" w:fill="E4E8E4"/>
+            <w:tcMar>
+              <w:top w:w="90" w:type="dxa"/>
+              <w:left w:w="120" w:type="dxa"/>
+              <w:bottom w:w="90" w:type="dxa"/>
+              <w:right w:w="120" w:type="dxa"/>
+            </w:tcMar>
+          </w:tcPr>
+          <w:p>
+            <w:r>
+              <w:rPr>
+                <w:rFonts w:ascii="Consolas" w:eastAsia="Consolas" w:hAnsi="Consolas" w:cs="Consolas"/>
+                <w:b/>
+                <w:bCs/>
+                <w:color w:val="6A716A"/>
+                <w:sz w:val="14"/>
+                <w:szCs w:val="14"/>
+              </w:rPr>
+              <w:t>GÖREV</w:t>
+            </w:r>
+          </w:p>
+        </w:tc>
+        <w:tc>
+          <w:tcPr>
+            <w:tcW w:w="3300" w:type="dxa"/>
+            <w:tcBorders>
+              <w:top w:val="single" w:sz="4" w:space="0" w:color="D5D9D3"/>
+              <w:left w:val="single" w:sz="4" w:space="0" w:color="D5D9D3"/>
+              <w:bottom w:val="single" w:sz="4" w:space="0" w:color="D5D9D3"/>
+              <w:right w:val="single" w:sz="4" w:space="0" w:color="D5D9D3"/>
+            </w:tcBorders>
+            <w:shd w:val="clear" w:color="auto" w:fill="E4E8E4"/>
+            <w:tcMar>
+              <w:top w:w="90" w:type="dxa"/>
+              <w:left w:w="120" w:type="dxa"/>
+              <w:bottom w:w="90" w:type="dxa"/>
+              <w:right w:w="120" w:type="dxa"/>
+            </w:tcMar>
+          </w:tcPr>
+          <w:p>
+            <w:r>
+              <w:rPr>
+                <w:rFonts w:ascii="Consolas" w:eastAsia="Consolas" w:hAnsi="Consolas" w:cs="Consolas"/>
+                <w:b/>
+                <w:bCs/>
+                <w:color w:val="6A716A"/>
+                <w:sz w:val="14"/>
+                <w:szCs w:val="14"/>
+              </w:rPr>
+              <w:t>BITTI SAYILIR KI…</w:t>
+            </w:r>
+          </w:p>
+        </w:tc>
+      </w:tr>
+      <w:tr>
+        <w:tblPrEx>
+          <w:tblCellMar>
+            <w:top w:w="0" w:type="dxa"/>
+            <w:bottom w:w="0" w:type="dxa"/>
+          </w:tblCellMar>
+        </w:tblPrEx>
+        <w:tc>
+          <w:tcPr>
+            <w:tcW w:w="520" w:type="dxa"/>
+            <w:tcBorders>
+              <w:top w:val="single" w:sz="4" w:space="0" w:color="D5D9D3"/>
+              <w:left w:val="single" w:sz="4" w:space="0" w:color="D5D9D3"/>
+              <w:bottom w:val="single" w:sz="4" w:space="0" w:color="D5D9D3"/>
+              <w:right w:val="single" w:sz="4" w:space="0" w:color="D5D9D3"/>
+            </w:tcBorders>
+            <w:tcMar>
+              <w:top w:w="90" w:type="dxa"/>
+              <w:left w:w="120" w:type="dxa"/>
+              <w:bottom w:w="90" w:type="dxa"/>
+              <w:right w:w="120" w:type="dxa"/>
+            </w:tcMar>
+          </w:tcPr>
+          <w:p>
+            <w:pPr>
+              <w:jc w:val="center"/>
+            </w:pPr>
+            <w:r>
+              <w:rPr>
+                <w:rFonts w:ascii="Segoe UI Symbol" w:eastAsia="Segoe UI Symbol" w:hAnsi="Segoe UI Symbol" w:cs="Segoe UI Symbol"/>
+                <w:color w:val="0B5F56"/>
+                <w:sz w:val="24"/>
+                <w:szCs w:val="24"/>
+              </w:rPr>
+              <w:t>☑</w:t>
+            </w:r>
+          </w:p>
+        </w:tc>
+        <w:tc>
+          <w:tcPr>
+            <w:tcW w:w="5180" w:type="dxa"/>
+            <w:tcBorders>
+              <w:top w:val="single" w:sz="4" w:space="0" w:color="D5D9D3"/>
+              <w:left w:val="single" w:sz="4" w:space="0" w:color="D5D9D3"/>
+              <w:bottom w:val="single" w:sz="4" w:space="0" w:color="D5D9D3"/>
+              <w:right w:val="single" w:sz="4" w:space="0" w:color="D5D9D3"/>
+            </w:tcBorders>
+            <w:tcMar>
+              <w:top w:w="90" w:type="dxa"/>
+              <w:left w:w="120" w:type="dxa"/>
+              <w:bottom w:w="90" w:type="dxa"/>
+              <w:right w:w="120" w:type="dxa"/>
+            </w:tcMar>
+          </w:tcPr>
+          <w:p>
+            <w:r>
+              <w:rPr>
+                <w:sz w:val="19"/>
+                <w:szCs w:val="19"/>
+              </w:rPr>
+              <w:t xml:space="preserve">Başvuru formu gerçek veritabanına yazıyor</w:t>
+            </w:r>
+          </w:p>
+        </w:tc>
+        <w:tc>
+          <w:tcPr>
+            <w:tcW w:w="3300" w:type="dxa"/>
+            <w:tcBorders>
+              <w:top w:val="single" w:sz="4" w:space="0" w:color="D5D9D3"/>
+              <w:left w:val="single" w:sz="4" w:space="0" w:color="D5D9D3"/>
+              <w:bottom w:val="single" w:sz="4" w:space="0" w:color="D5D9D3"/>
+              <w:right w:val="single" w:sz="4" w:space="0" w:color="D5D9D3"/>
+            </w:tcBorders>
+            <w:tcMar>
+              <w:top w:w="90" w:type="dxa"/>
+              <w:left w:w="120" w:type="dxa"/>
+              <w:bottom w:w="90" w:type="dxa"/>
+              <w:right w:w="120" w:type="dxa"/>
+            </w:tcMar>
+          </w:tcPr>
+          <w:p>
+            <w:r>
+              <w:rPr>
+                <w:color w:val="6A716A"/>
+                <w:sz w:val="17"/>
+                <w:szCs w:val="17"/>
+              </w:rPr>
+              <w:t xml:space="preserve">Kayıt tarayıcı hafızasında değil, veritabanında</w:t>
+            </w:r>
+          </w:p>
+        </w:tc>
+      </w:tr>
+      <w:tr>
+        <w:tblPrEx>
+          <w:tblCellMar>
+            <w:top w:w="0" w:type="dxa"/>
+            <w:bottom w:w="0" w:type="dxa"/>
+          </w:tblCellMar>
+        </w:tblPrEx>
+        <w:tc>
+          <w:tcPr>
+            <w:tcW w:w="520" w:type="dxa"/>
+            <w:tcBorders>
+              <w:top w:val="single" w:sz="4" w:space="0" w:color="D5D9D3"/>
+              <w:left w:val="single" w:sz="4" w:space="0" w:color="D5D9D3"/>
+              <w:bottom w:val="single" w:sz="4" w:space="0" w:color="D5D9D3"/>
+              <w:right w:val="single" w:sz="4" w:space="0" w:color="D5D9D3"/>
+            </w:tcBorders>
+            <w:tcMar>
+              <w:top w:w="90" w:type="dxa"/>
+              <w:left w:w="120" w:type="dxa"/>
+              <w:bottom w:w="90" w:type="dxa"/>
+              <w:right w:w="120" w:type="dxa"/>
+            </w:tcMar>
+          </w:tcPr>
+          <w:p>
+            <w:pPr>
+              <w:jc w:val="center"/>
+            </w:pPr>
+            <w:r>
+              <w:rPr>
+                <w:rFonts w:ascii="Segoe UI Symbol" w:eastAsia="Segoe UI Symbol" w:hAnsi="Segoe UI Symbol" w:cs="Segoe UI Symbol"/>
+                <w:color w:val="0B5F56"/>
+                <w:sz w:val="24"/>
+                <w:szCs w:val="24"/>
+              </w:rPr>
+              <w:t>☑</w:t>
+            </w:r>
+          </w:p>
+        </w:tc>
+        <w:tc>
+          <w:tcPr>
+            <w:tcW w:w="5180" w:type="dxa"/>
+            <w:tcBorders>
+              <w:top w:val="single" w:sz="4" w:space="0" w:color="D5D9D3"/>
+              <w:left w:val="single" w:sz="4" w:space="0" w:color="D5D9D3"/>
+              <w:bottom w:val="single" w:sz="4" w:space="0" w:color="D5D9D3"/>
+              <w:right w:val="single" w:sz="4" w:space="0" w:color="D5D9D3"/>
+            </w:tcBorders>
+            <w:tcMar>
+              <w:top w:w="90" w:type="dxa"/>
+              <w:left w:w="120" w:type="dxa"/>
+              <w:bottom w:w="90" w:type="dxa"/>
+              <w:right w:w="120" w:type="dxa"/>
+            </w:tcMar>
+          </w:tcPr>
+          <w:p>
+            <w:r>
+              <w:rPr>
+                <w:sz w:val="19"/>
+                <w:szCs w:val="19"/>
+              </w:rPr>
+              <w:t xml:space="preserve">Bekleyen başvurular listesi veritabanından okunuyor</w:t>
+            </w:r>
+          </w:p>
+        </w:tc>
+        <w:tc>
+          <w:tcPr>
+            <w:tcW w:w="3300" w:type="dxa"/>
+            <w:tcBorders>
+              <w:top w:val="single" w:sz="4" w:space="0" w:color="D5D9D3"/>
+              <w:left w:val="single" w:sz="4" w:space="0" w:color="D5D9D3"/>
+              <w:bottom w:val="single" w:sz="4" w:space="0" w:color="D5D9D3"/>
+              <w:right w:val="single" w:sz="4" w:space="0" w:color="D5D9D3"/>
+            </w:tcBorders>
+            <w:tcMar>
+              <w:top w:w="90" w:type="dxa"/>
+              <w:left w:w="120" w:type="dxa"/>
+              <w:bottom w:w="90" w:type="dxa"/>
+              <w:right w:w="120" w:type="dxa"/>
+            </w:tcMar>
+          </w:tcPr>
+          <w:p>
+            <w:r>
+              <w:rPr>
+                <w:color w:val="6A716A"/>
+                <w:sz w:val="17"/>
+                <w:szCs w:val="17"/>
+              </w:rPr>
+              <w:t xml:space="preserve">Liste defterden geliyor, örnek veri yok</w:t>
+            </w:r>
+          </w:p>
+        </w:tc>
+      </w:tr>
+      <w:tr>
+        <w:tblPrEx>
+          <w:tblCellMar>
+            <w:top w:w="0" w:type="dxa"/>
+            <w:bottom w:w="0" w:type="dxa"/>
+          </w:tblCellMar>
+        </w:tblPrEx>
+        <w:tc>
+          <w:tcPr>
+            <w:tcW w:w="520" w:type="dxa"/>
+            <w:tcBorders>
+              <w:top w:val="single" w:sz="4" w:space="0" w:color="D5D9D3"/>
+              <w:left w:val="single" w:sz="4" w:space="0" w:color="D5D9D3"/>
+              <w:bottom w:val="single" w:sz="4" w:space="0" w:color="D5D9D3"/>
+              <w:right w:val="single" w:sz="4" w:space="0" w:color="D5D9D3"/>
+            </w:tcBorders>
+            <w:tcMar>
+              <w:top w:w="90" w:type="dxa"/>
+              <w:left w:w="120" w:type="dxa"/>
+              <w:bottom w:w="90" w:type="dxa"/>
+              <w:right w:w="120" w:type="dxa"/>
+            </w:tcMar>
+          </w:tcPr>
+          <w:p>
+            <w:pPr>
+              <w:jc w:val="center"/>
+            </w:pPr>
+            <w:r>
+              <w:rPr>
+                <w:rFonts w:ascii="Segoe UI Symbol" w:eastAsia="Segoe UI Symbol" w:hAnsi="Segoe UI Symbol" w:cs="Segoe UI Symbol"/>
+                <w:color w:val="0B5F56"/>
+                <w:sz w:val="24"/>
+                <w:szCs w:val="24"/>
+              </w:rPr>
+              <w:t>☐</w:t>
+            </w:r>
+          </w:p>
+        </w:tc>
+        <w:tc>
+          <w:tcPr>
+            <w:tcW w:w="5180" w:type="dxa"/>
+            <w:tcBorders>
+              <w:top w:val="single" w:sz="4" w:space="0" w:color="D5D9D3"/>
+              <w:left w:val="single" w:sz="4" w:space="0" w:color="D5D9D3"/>
+              <w:bottom w:val="single" w:sz="4" w:space="0" w:color="D5D9D3"/>
+              <w:right w:val="single" w:sz="4" w:space="0" w:color="D5D9D3"/>
+            </w:tcBorders>
+            <w:tcMar>
+              <w:top w:w="90" w:type="dxa"/>
+              <w:left w:w="120" w:type="dxa"/>
+              <w:bottom w:w="90" w:type="dxa"/>
+              <w:right w:w="120" w:type="dxa"/>
+            </w:tcMar>
+          </w:tcPr>
+          <w:p>
+            <w:r>
+              <w:rPr>
+                <w:sz w:val="19"/>
+                <w:szCs w:val="19"/>
+              </w:rPr>
+              <w:t xml:space="preserve">Onay firma + şube + lisansı Postgres’te oluşturuyor</w:t>
+            </w:r>
+          </w:p>
+        </w:tc>
+        <w:tc>
+          <w:tcPr>
+            <w:tcW w:w="3300" w:type="dxa"/>
+            <w:tcBorders>
+              <w:top w:val="single" w:sz="4" w:space="0" w:color="D5D9D3"/>
+              <w:left w:val="single" w:sz="4" w:space="0" w:color="D5D9D3"/>
+              <w:bottom w:val="single" w:sz="4" w:space="0" w:color="D5D9D3"/>
+              <w:right w:val="single" w:sz="4" w:space="0" w:color="D5D9D3"/>
+            </w:tcBorders>
+            <w:tcMar>
+              <w:top w:w="90" w:type="dxa"/>
+              <w:left w:w="120" w:type="dxa"/>
+              <w:bottom w:w="90" w:type="dxa"/>
+              <w:right w:w="120" w:type="dxa"/>
+            </w:tcMar>
+          </w:tcPr>
+          <w:p>
+            <w:r>
+              <w:rPr>
+                <w:color w:val="6A716A"/>
+                <w:sz w:val="17"/>
+                <w:szCs w:val="17"/>
+              </w:rPr>
+              <w:t xml:space="preserve">Üçü de veritabanında — lisans HENÜZ tarayıcı hafızasında</w:t>
+            </w:r>
+          </w:p>
+        </w:tc>
+      </w:tr>
+      <w:tr>
+        <w:tblPrEx>
+          <w:tblCellMar>
+            <w:top w:w="0" w:type="dxa"/>
+            <w:bottom w:w="0" w:type="dxa"/>
+          </w:tblCellMar>
+        </w:tblPrEx>
+        <w:tc>
+          <w:tcPr>
+            <w:tcW w:w="520" w:type="dxa"/>
+            <w:tcBorders>
+              <w:top w:val="single" w:sz="4" w:space="0" w:color="D5D9D3"/>
+              <w:left w:val="single" w:sz="4" w:space="0" w:color="D5D9D3"/>
+              <w:bottom w:val="single" w:sz="4" w:space="0" w:color="D5D9D3"/>
+              <w:right w:val="single" w:sz="4" w:space="0" w:color="D5D9D3"/>
+            </w:tcBorders>
+            <w:tcMar>
+              <w:top w:w="90" w:type="dxa"/>
+              <w:left w:w="120" w:type="dxa"/>
+              <w:bottom w:w="90" w:type="dxa"/>
+              <w:right w:w="120" w:type="dxa"/>
+            </w:tcMar>
+          </w:tcPr>
+          <w:p>
+            <w:pPr>
+              <w:jc w:val="center"/>
+            </w:pPr>
+            <w:r>
+              <w:rPr>
+                <w:rFonts w:ascii="Segoe UI Symbol" w:eastAsia="Segoe UI Symbol" w:hAnsi="Segoe UI Symbol" w:cs="Segoe UI Symbol"/>
+                <w:color w:val="0B5F56"/>
+                <w:sz w:val="24"/>
+                <w:szCs w:val="24"/>
+              </w:rPr>
+              <w:t>☑</w:t>
+            </w:r>
+          </w:p>
+        </w:tc>
+        <w:tc>
+          <w:tcPr>
+            <w:tcW w:w="5180" w:type="dxa"/>
+            <w:tcBorders>
+              <w:top w:val="single" w:sz="4" w:space="0" w:color="D5D9D3"/>
+              <w:left w:val="single" w:sz="4" w:space="0" w:color="D5D9D3"/>
+              <w:bottom w:val="single" w:sz="4" w:space="0" w:color="D5D9D3"/>
+              <w:right w:val="single" w:sz="4" w:space="0" w:color="D5D9D3"/>
+            </w:tcBorders>
+            <w:tcMar>
+              <w:top w:w="90" w:type="dxa"/>
+              <w:left w:w="120" w:type="dxa"/>
+              <w:bottom w:w="90" w:type="dxa"/>
+              <w:right w:w="120" w:type="dxa"/>
+            </w:tcMar>
+          </w:tcPr>
+          <w:p>
+            <w:r>
+              <w:rPr>
+                <w:sz w:val="19"/>
+                <w:szCs w:val="19"/>
+              </w:rPr>
+              <w:t xml:space="preserve">Onay Supabase Auth hesabı açıyor</w:t>
+            </w:r>
+          </w:p>
+        </w:tc>
+        <w:tc>
+          <w:tcPr>
+            <w:tcW w:w="3300" w:type="dxa"/>
+            <w:tcBorders>
+              <w:top w:val="single" w:sz="4" w:space="0" w:color="D5D9D3"/>
+              <w:left w:val="single" w:sz="4" w:space="0" w:color="D5D9D3"/>
+              <w:bottom w:val="single" w:sz="4" w:space="0" w:color="D5D9D3"/>
+              <w:right w:val="single" w:sz="4" w:space="0" w:color="D5D9D3"/>
+            </w:tcBorders>
+            <w:tcMar>
+              <w:top w:w="90" w:type="dxa"/>
+              <w:left w:w="120" w:type="dxa"/>
+              <w:bottom w:w="90" w:type="dxa"/>
+              <w:right w:w="120" w:type="dxa"/>
+            </w:tcMar>
+          </w:tcPr>
+          <w:p>
+            <w:r>
+              <w:rPr>
+                <w:color w:val="6A716A"/>
+                <w:sz w:val="17"/>
+                <w:szCs w:val="17"/>
+              </w:rPr>
+              <w:t xml:space="preserve">Müşteri kendi e-postasıyla giriş yapabiliyor</w:t>
+            </w:r>
+          </w:p>
+        </w:tc>
+      </w:tr>
+      <w:tr>
+        <w:tblPrEx>
+          <w:tblCellMar>
+            <w:top w:w="0" w:type="dxa"/>
+            <w:bottom w:w="0" w:type="dxa"/>
+          </w:tblCellMar>
+        </w:tblPrEx>
+        <w:tc>
+          <w:tcPr>
+            <w:tcW w:w="520" w:type="dxa"/>
+            <w:tcBorders>
+              <w:top w:val="single" w:sz="4" w:space="0" w:color="D5D9D3"/>
+              <w:left w:val="single" w:sz="4" w:space="0" w:color="D5D9D3"/>
+              <w:bottom w:val="single" w:sz="4" w:space="0" w:color="D5D9D3"/>
+              <w:right w:val="single" w:sz="4" w:space="0" w:color="D5D9D3"/>
+            </w:tcBorders>
+            <w:tcMar>
+              <w:top w:w="90" w:type="dxa"/>
+              <w:left w:w="120" w:type="dxa"/>
+              <w:bottom w:w="90" w:type="dxa"/>
+              <w:right w:w="120" w:type="dxa"/>
+            </w:tcMar>
+          </w:tcPr>
+          <w:p>
+            <w:pPr>
+              <w:jc w:val="center"/>
+            </w:pPr>
+            <w:r>
+              <w:rPr>
+                <w:rFonts w:ascii="Segoe UI Symbol" w:eastAsia="Segoe UI Symbol" w:hAnsi="Segoe UI Symbol" w:cs="Segoe UI Symbol"/>
+                <w:color w:val="0B5F56"/>
+                <w:sz w:val="24"/>
+                <w:szCs w:val="24"/>
+              </w:rPr>
+              <w:t>☑</w:t>
+            </w:r>
+          </w:p>
+        </w:tc>
+        <w:tc>
+          <w:tcPr>
+            <w:tcW w:w="5180" w:type="dxa"/>
+            <w:tcBorders>
+              <w:top w:val="single" w:sz="4" w:space="0" w:color="D5D9D3"/>
+              <w:left w:val="single" w:sz="4" w:space="0" w:color="D5D9D3"/>
+              <w:bottom w:val="single" w:sz="4" w:space="0" w:color="D5D9D3"/>
+              <w:right w:val="single" w:sz="4" w:space="0" w:color="D5D9D3"/>
+            </w:tcBorders>
+            <w:tcMar>
+              <w:top w:w="90" w:type="dxa"/>
+              <w:left w:w="120" w:type="dxa"/>
+              <w:bottom w:w="90" w:type="dxa"/>
+              <w:right w:w="120" w:type="dxa"/>
+            </w:tcMar>
+          </w:tcPr>
+          <w:p>
+            <w:r>
+              <w:rPr>
+                <w:sz w:val="19"/>
+                <w:szCs w:val="19"/>
+              </w:rPr>
+              <w:t xml:space="preserve">Davet e-postası gidiyor</w:t>
+            </w:r>
+          </w:p>
+        </w:tc>
+        <w:tc>
+          <w:tcPr>
+            <w:tcW w:w="3300" w:type="dxa"/>
+            <w:tcBorders>
+              <w:top w:val="single" w:sz="4" w:space="0" w:color="D5D9D3"/>
+              <w:left w:val="single" w:sz="4" w:space="0" w:color="D5D9D3"/>
+              <w:bottom w:val="single" w:sz="4" w:space="0" w:color="D5D9D3"/>
+              <w:right w:val="single" w:sz="4" w:space="0" w:color="D5D9D3"/>
+            </w:tcBorders>
+            <w:tcMar>
+              <w:top w:w="90" w:type="dxa"/>
+              <w:left w:w="120" w:type="dxa"/>
+              <w:bottom w:w="90" w:type="dxa"/>
+              <w:right w:w="120" w:type="dxa"/>
+            </w:tcMar>
+          </w:tcPr>
+          <w:p>
+            <w:r>
+              <w:rPr>
+                <w:color w:val="6A716A"/>
+                <w:sz w:val="17"/>
+                <w:szCs w:val="17"/>
+              </w:rPr>
+              <w:t xml:space="preserve">Mail işletmenin kendi adresine ulaşıyor</w:t>
+            </w:r>
+          </w:p>
+        </w:tc>
+      </w:tr>
+      <w:tr>
+        <w:tblPrEx>
+          <w:tblCellMar>
+            <w:top w:w="0" w:type="dxa"/>
+            <w:bottom w:w="0" w:type="dxa"/>
+          </w:tblCellMar>
+        </w:tblPrEx>
+        <w:tc>
+          <w:tcPr>
+            <w:tcW w:w="520" w:type="dxa"/>
+            <w:tcBorders>
+              <w:top w:val="single" w:sz="4" w:space="0" w:color="D5D9D3"/>
+              <w:left w:val="single" w:sz="4" w:space="0" w:color="D5D9D3"/>
+              <w:bottom w:val="single" w:sz="4" w:space="0" w:color="D5D9D3"/>
+              <w:right w:val="single" w:sz="4" w:space="0" w:color="D5D9D3"/>
+            </w:tcBorders>
+            <w:tcMar>
+              <w:top w:w="90" w:type="dxa"/>
+              <w:left w:w="120" w:type="dxa"/>
+              <w:bottom w:w="90" w:type="dxa"/>
+              <w:right w:w="120" w:type="dxa"/>
+            </w:tcMar>
+          </w:tcPr>
+          <w:p>
+            <w:pPr>
+              <w:jc w:val="center"/>
+            </w:pPr>
+            <w:r>
+              <w:rPr>
+                <w:rFonts w:ascii="Segoe UI Symbol" w:eastAsia="Segoe UI Symbol" w:hAnsi="Segoe UI Symbol" w:cs="Segoe UI Symbol"/>
+                <w:color w:val="0B5F56"/>
+                <w:sz w:val="24"/>
+                <w:szCs w:val="24"/>
+              </w:rPr>
+              <w:t>☑</w:t>
+            </w:r>
+          </w:p>
+        </w:tc>
+        <w:tc>
+          <w:tcPr>
+            <w:tcW w:w="5180" w:type="dxa"/>
+            <w:tcBorders>
+              <w:top w:val="single" w:sz="4" w:space="0" w:color="D5D9D3"/>
+              <w:left w:val="single" w:sz="4" w:space="0" w:color="D5D9D3"/>
+              <w:bottom w:val="single" w:sz="4" w:space="0" w:color="D5D9D3"/>
+              <w:right w:val="single" w:sz="4" w:space="0" w:color="D5D9D3"/>
+            </w:tcBorders>
+            <w:tcMar>
+              <w:top w:w="90" w:type="dxa"/>
+              <w:left w:w="120" w:type="dxa"/>
+              <w:bottom w:w="90" w:type="dxa"/>
+              <w:right w:w="120" w:type="dxa"/>
+            </w:tcMar>
+          </w:tcPr>
+          <w:p>
+            <w:r>
+              <w:rPr>
+                <w:sz w:val="19"/>
+                <w:szCs w:val="19"/>
+              </w:rPr>
+              <w:t xml:space="preserve">İlk oturumda şifreyi kullanıcı belirliyor</w:t>
+            </w:r>
+          </w:p>
+        </w:tc>
+        <w:tc>
+          <w:tcPr>
+            <w:tcW w:w="3300" w:type="dxa"/>
+            <w:tcBorders>
+              <w:top w:val="single" w:sz="4" w:space="0" w:color="D5D9D3"/>
+              <w:left w:val="single" w:sz="4" w:space="0" w:color="D5D9D3"/>
+              <w:bottom w:val="single" w:sz="4" w:space="0" w:color="D5D9D3"/>
+              <w:right w:val="single" w:sz="4" w:space="0" w:color="D5D9D3"/>
+            </w:tcBorders>
+            <w:tcMar>
+              <w:top w:w="90" w:type="dxa"/>
+              <w:left w:w="120" w:type="dxa"/>
+              <w:bottom w:w="90" w:type="dxa"/>
+              <w:right w:w="120" w:type="dxa"/>
+            </w:tcMar>
+          </w:tcPr>
+          <w:p>
+            <w:r>
+              <w:rPr>
+                <w:color w:val="6A716A"/>
+                <w:sz w:val="17"/>
+                <w:szCs w:val="17"/>
+              </w:rPr>
+              <w:t xml:space="preserve">MİYOP şifre üretmiyor, görmüyor, göstermiyor</w:t>
+            </w:r>
+          </w:p>
+        </w:tc>
+      </w:tr>
+      <w:tr>
+        <w:tblPrEx>
+          <w:tblCellMar>
+            <w:top w:w="0" w:type="dxa"/>
+            <w:bottom w:w="0" w:type="dxa"/>
+          </w:tblCellMar>
+        </w:tblPrEx>
+        <w:tc>
+          <w:tcPr>
+            <w:tcW w:w="520" w:type="dxa"/>
+            <w:tcBorders>
+              <w:top w:val="single" w:sz="4" w:space="0" w:color="D5D9D3"/>
+              <w:left w:val="single" w:sz="4" w:space="0" w:color="D5D9D3"/>
+              <w:bottom w:val="single" w:sz="4" w:space="0" w:color="D5D9D3"/>
+              <w:right w:val="single" w:sz="4" w:space="0" w:color="D5D9D3"/>
+            </w:tcBorders>
+            <w:tcMar>
+              <w:top w:w="90" w:type="dxa"/>
+              <w:left w:w="120" w:type="dxa"/>
+              <w:bottom w:w="90" w:type="dxa"/>
+              <w:right w:w="120" w:type="dxa"/>
+            </w:tcMar>
+          </w:tcPr>
+          <w:p>
+            <w:pPr>
+              <w:jc w:val="center"/>
+            </w:pPr>
+            <w:r>
+              <w:rPr>
+                <w:rFonts w:ascii="Segoe UI Symbol" w:eastAsia="Segoe UI Symbol" w:hAnsi="Segoe UI Symbol" w:cs="Segoe UI Symbol"/>
+                <w:color w:val="0B5F56"/>
+                <w:sz w:val="24"/>
+                <w:szCs w:val="24"/>
+              </w:rPr>
+              <w:t>☑</w:t>
+            </w:r>
+          </w:p>
+        </w:tc>
+        <w:tc>
+          <w:tcPr>
+            <w:tcW w:w="5180" w:type="dxa"/>
+            <w:tcBorders>
+              <w:top w:val="single" w:sz="4" w:space="0" w:color="D5D9D3"/>
+              <w:left w:val="single" w:sz="4" w:space="0" w:color="D5D9D3"/>
+              <w:bottom w:val="single" w:sz="4" w:space="0" w:color="D5D9D3"/>
+              <w:right w:val="single" w:sz="4" w:space="0" w:color="D5D9D3"/>
+            </w:tcBorders>
+            <w:tcMar>
+              <w:top w:w="90" w:type="dxa"/>
+              <w:left w:w="120" w:type="dxa"/>
+              <w:bottom w:w="90" w:type="dxa"/>
+              <w:right w:w="120" w:type="dxa"/>
+            </w:tcMar>
+          </w:tcPr>
+          <w:p>
+            <w:r>
+              <w:rPr>
+                <w:sz w:val="19"/>
+                <w:szCs w:val="19"/>
+              </w:rPr>
+              <w:t xml:space="preserve">Sektöre özel modüller onaydan sonra açık geliyor</w:t>
+            </w:r>
+          </w:p>
+        </w:tc>
+        <w:tc>
+          <w:tcPr>
+            <w:tcW w:w="3300" w:type="dxa"/>
+            <w:tcBorders>
+              <w:top w:val="single" w:sz="4" w:space="0" w:color="D5D9D3"/>
+              <w:left w:val="single" w:sz="4" w:space="0" w:color="D5D9D3"/>
+              <w:bottom w:val="single" w:sz="4" w:space="0" w:color="D5D9D3"/>
+              <w:right w:val="single" w:sz="4" w:space="0" w:color="D5D9D3"/>
+            </w:tcBorders>
+            <w:tcMar>
+              <w:top w:w="90" w:type="dxa"/>
+              <w:left w:w="120" w:type="dxa"/>
+              <w:bottom w:w="90" w:type="dxa"/>
+              <w:right w:w="120" w:type="dxa"/>
+            </w:tcMar>
+          </w:tcPr>
+          <w:p>
+            <w:r>
+              <w:rPr>
+                <w:color w:val="6A716A"/>
+                <w:sz w:val="17"/>
+                <w:szCs w:val="17"/>
+              </w:rPr>
+              <w:t xml:space="preserve">Mutfak modülleri menüde; başka sektörün modülü yok</w:t>
+            </w:r>
+          </w:p>
+        </w:tc>
+      </w:tr>
+      <w:tr>
+        <w:tblPrEx>
+          <w:tblCellMar>
+            <w:top w:w="0" w:type="dxa"/>
+            <w:bottom w:w="0" w:type="dxa"/>
+          </w:tblCellMar>
+        </w:tblPrEx>
+        <w:tc>
+          <w:tcPr>
+            <w:tcW w:w="520" w:type="dxa"/>
+            <w:tcBorders>
+              <w:top w:val="single" w:sz="4" w:space="0" w:color="D5D9D3"/>
+              <w:left w:val="single" w:sz="4" w:space="0" w:color="D5D9D3"/>
+              <w:bottom w:val="single" w:sz="4" w:space="0" w:color="D5D9D3"/>
+              <w:right w:val="single" w:sz="4" w:space="0" w:color="D5D9D3"/>
+            </w:tcBorders>
+            <w:tcMar>
+              <w:top w:w="90" w:type="dxa"/>
+              <w:left w:w="120" w:type="dxa"/>
+              <w:bottom w:w="90" w:type="dxa"/>
+              <w:right w:w="120" w:type="dxa"/>
+            </w:tcMar>
+          </w:tcPr>
+          <w:p>
+            <w:pPr>
+              <w:jc w:val="center"/>
+            </w:pPr>
+            <w:r>
+              <w:rPr>
+                <w:rFonts w:ascii="Segoe UI Symbol" w:eastAsia="Segoe UI Symbol" w:hAnsi="Segoe UI Symbol" w:cs="Segoe UI Symbol"/>
+                <w:color w:val="0B5F56"/>
+                <w:sz w:val="24"/>
+                <w:szCs w:val="24"/>
+              </w:rPr>
+              <w:t>☑</w:t>
+            </w:r>
+          </w:p>
+        </w:tc>
+        <w:tc>
+          <w:tcPr>
+            <w:tcW w:w="5180" w:type="dxa"/>
+            <w:tcBorders>
+              <w:top w:val="single" w:sz="4" w:space="0" w:color="D5D9D3"/>
+              <w:left w:val="single" w:sz="4" w:space="0" w:color="D5D9D3"/>
+              <w:bottom w:val="single" w:sz="4" w:space="0" w:color="D5D9D3"/>
+              <w:right w:val="single" w:sz="4" w:space="0" w:color="D5D9D3"/>
+            </w:tcBorders>
+            <w:tcMar>
+              <w:top w:w="90" w:type="dxa"/>
+              <w:left w:w="120" w:type="dxa"/>
+              <w:bottom w:w="90" w:type="dxa"/>
+              <w:right w:w="120" w:type="dxa"/>
+            </w:tcMar>
+          </w:tcPr>
+          <w:p>
+            <w:r>
+              <w:rPr>
+                <w:sz w:val="19"/>
+                <w:szCs w:val="19"/>
+              </w:rPr>
+              <w:t xml:space="preserve">Red ve iptal yolları da veritabanında</w:t>
+            </w:r>
+          </w:p>
+        </w:tc>
+        <w:tc>
+          <w:tcPr>
+            <w:tcW w:w="3300" w:type="dxa"/>
+            <w:tcBorders>
+              <w:top w:val="single" w:sz="4" w:space="0" w:color="D5D9D3"/>
+              <w:left w:val="single" w:sz="4" w:space="0" w:color="D5D9D3"/>
+              <w:bottom w:val="single" w:sz="4" w:space="0" w:color="D5D9D3"/>
+              <w:right w:val="single" w:sz="4" w:space="0" w:color="D5D9D3"/>
+            </w:tcBorders>
+            <w:tcMar>
+              <w:top w:w="90" w:type="dxa"/>
+              <w:left w:w="120" w:type="dxa"/>
+              <w:bottom w:w="90" w:type="dxa"/>
+              <w:right w:w="120" w:type="dxa"/>
+            </w:tcMar>
+          </w:tcPr>
+          <w:p>
+            <w:r>
+              <w:rPr>
+                <w:color w:val="6A716A"/>
+                <w:sz w:val="17"/>
+                <w:szCs w:val="17"/>
+              </w:rPr>
+              <w:t xml:space="preserve">Karar ve gerekçe kayıtlı</w:t>
+            </w:r>
+          </w:p>
+        </w:tc>
+      </w:tr>
+      <w:tr>
+        <w:tblPrEx>
+          <w:tblCellMar>
+            <w:top w:w="0" w:type="dxa"/>
+            <w:bottom w:w="0" w:type="dxa"/>
+          </w:tblCellMar>
+        </w:tblPrEx>
+        <w:tc>
+          <w:tcPr>
+            <w:tcW w:w="520" w:type="dxa"/>
+            <w:tcBorders>
+              <w:top w:val="single" w:sz="4" w:space="0" w:color="D5D9D3"/>
+              <w:left w:val="single" w:sz="4" w:space="0" w:color="D5D9D3"/>
+              <w:bottom w:val="single" w:sz="4" w:space="0" w:color="D5D9D3"/>
+              <w:right w:val="single" w:sz="4" w:space="0" w:color="D5D9D3"/>
+            </w:tcBorders>
+            <w:tcMar>
+              <w:top w:w="90" w:type="dxa"/>
+              <w:left w:w="120" w:type="dxa"/>
+              <w:bottom w:w="90" w:type="dxa"/>
+              <w:right w:w="120" w:type="dxa"/>
+            </w:tcMar>
+          </w:tcPr>
+          <w:p>
+            <w:pPr>
+              <w:jc w:val="center"/>
+            </w:pPr>
+            <w:r>
+              <w:rPr>
+                <w:rFonts w:ascii="Segoe UI Symbol" w:eastAsia="Segoe UI Symbol" w:hAnsi="Segoe UI Symbol" w:cs="Segoe UI Symbol"/>
+                <w:color w:val="0B5F56"/>
+                <w:sz w:val="24"/>
+                <w:szCs w:val="24"/>
+              </w:rPr>
+              <w:t>☑</w:t>
+            </w:r>
+          </w:p>
+        </w:tc>
+        <w:tc>
+          <w:tcPr>
+            <w:tcW w:w="5180" w:type="dxa"/>
+            <w:tcBorders>
+              <w:top w:val="single" w:sz="4" w:space="0" w:color="D5D9D3"/>
+              <w:left w:val="single" w:sz="4" w:space="0" w:color="D5D9D3"/>
+              <w:bottom w:val="single" w:sz="4" w:space="0" w:color="D5D9D3"/>
+              <w:right w:val="single" w:sz="4" w:space="0" w:color="D5D9D3"/>
+            </w:tcBorders>
+            <w:tcMar>
+              <w:top w:w="90" w:type="dxa"/>
+              <w:left w:w="120" w:type="dxa"/>
+              <w:bottom w:w="90" w:type="dxa"/>
+              <w:right w:w="120" w:type="dxa"/>
+            </w:tcMar>
+          </w:tcPr>
+          <w:p>
+            <w:r>
+              <w:rPr>
+                <w:sz w:val="19"/>
+                <w:szCs w:val="19"/>
+              </w:rPr>
+              <w:t xml:space="preserve">Başvuru geçmişi denetim kaydına düşüyor</w:t>
+            </w:r>
+          </w:p>
+        </w:tc>
+        <w:tc>
+          <w:tcPr>
+            <w:tcW w:w="3300" w:type="dxa"/>
+            <w:tcBorders>
+              <w:top w:val="single" w:sz="4" w:space="0" w:color="D5D9D3"/>
+              <w:left w:val="single" w:sz="4" w:space="0" w:color="D5D9D3"/>
+              <w:bottom w:val="single" w:sz="4" w:space="0" w:color="D5D9D3"/>
+              <w:right w:val="single" w:sz="4" w:space="0" w:color="D5D9D3"/>
+            </w:tcBorders>
+            <w:tcMar>
+              <w:top w:w="90" w:type="dxa"/>
+              <w:left w:w="120" w:type="dxa"/>
+              <w:bottom w:w="90" w:type="dxa"/>
+              <w:right w:w="120" w:type="dxa"/>
+            </w:tcMar>
+          </w:tcPr>
+          <w:p>
+            <w:r>
+              <w:rPr>
+                <w:color w:val="6A716A"/>
+                <w:sz w:val="17"/>
+                <w:szCs w:val="17"/>
+              </w:rPr>
+              <w:t xml:space="preserve">Her durum değişikliği olay defterinde</w:t>
+            </w:r>
+          </w:p>
+        </w:tc>
+      </w:tr>
+      <w:tr>
+        <w:tblPrEx>
+          <w:tblCellMar>
+            <w:top w:w="0" w:type="dxa"/>
+            <w:bottom w:w="0" w:type="dxa"/>
+          </w:tblCellMar>
+        </w:tblPrEx>
+        <w:tc>
+          <w:tcPr>
+            <w:tcW w:w="520" w:type="dxa"/>
+            <w:tcBorders>
+              <w:top w:val="single" w:sz="4" w:space="0" w:color="D5D9D3"/>
+              <w:left w:val="single" w:sz="4" w:space="0" w:color="D5D9D3"/>
+              <w:bottom w:val="single" w:sz="4" w:space="0" w:color="D5D9D3"/>
+              <w:right w:val="single" w:sz="4" w:space="0" w:color="D5D9D3"/>
+            </w:tcBorders>
+            <w:tcMar>
+              <w:top w:w="90" w:type="dxa"/>
+              <w:left w:w="120" w:type="dxa"/>
+              <w:bottom w:w="90" w:type="dxa"/>
+              <w:right w:w="120" w:type="dxa"/>
+            </w:tcMar>
+          </w:tcPr>
+          <w:p>
+            <w:pPr>
+              <w:jc w:val="center"/>
+            </w:pPr>
+            <w:r>
+              <w:rPr>
+                <w:rFonts w:ascii="Segoe UI Symbol" w:eastAsia="Segoe UI Symbol" w:hAnsi="Segoe UI Symbol" w:cs="Segoe UI Symbol"/>
+                <w:color w:val="0B5F56"/>
+                <w:sz w:val="24"/>
+                <w:szCs w:val="24"/>
+              </w:rPr>
+              <w:t>☑</w:t>
+            </w:r>
+          </w:p>
+        </w:tc>
+        <w:tc>
+          <w:tcPr>
+            <w:tcW w:w="5180" w:type="dxa"/>
+            <w:tcBorders>
+              <w:top w:val="single" w:sz="4" w:space="0" w:color="D5D9D3"/>
+              <w:left w:val="single" w:sz="4" w:space="0" w:color="D5D9D3"/>
+              <w:bottom w:val="single" w:sz="4" w:space="0" w:color="D5D9D3"/>
+              <w:right w:val="single" w:sz="4" w:space="0" w:color="D5D9D3"/>
+            </w:tcBorders>
+            <w:tcMar>
+              <w:top w:w="90" w:type="dxa"/>
+              <w:left w:w="120" w:type="dxa"/>
+              <w:bottom w:w="90" w:type="dxa"/>
+              <w:right w:w="120" w:type="dxa"/>
+            </w:tcMar>
+          </w:tcPr>
+          <w:p>
+            <w:r>
+              <w:rPr>
+                <w:sz w:val="19"/>
+                <w:szCs w:val="19"/>
+              </w:rPr>
+              <w:t xml:space="preserve">İki farklı firma birbirini görmüyor (canlı izolasyon sınaması)</w:t>
+            </w:r>
+          </w:p>
+        </w:tc>
+        <w:tc>
+          <w:tcPr>
+            <w:tcW w:w="3300" w:type="dxa"/>
+            <w:tcBorders>
+              <w:top w:val="single" w:sz="4" w:space="0" w:color="D5D9D3"/>
+              <w:left w:val="single" w:sz="4" w:space="0" w:color="D5D9D3"/>
+              <w:bottom w:val="single" w:sz="4" w:space="0" w:color="D5D9D3"/>
+              <w:right w:val="single" w:sz="4" w:space="0" w:color="D5D9D3"/>
+            </w:tcBorders>
+            <w:tcMar>
+              <w:top w:w="90" w:type="dxa"/>
+              <w:left w:w="120" w:type="dxa"/>
+              <w:bottom w:w="90" w:type="dxa"/>
+              <w:right w:w="120" w:type="dxa"/>
+            </w:tcMar>
+          </w:tcPr>
+          <w:p>
+            <w:r>
+              <w:rPr>
+                <w:color w:val="6A716A"/>
+                <w:sz w:val="17"/>
+                <w:szCs w:val="17"/>
+              </w:rPr>
+              <w:t xml:space="preserve">Prova her koşuda çalışıyor ve kırmızıya düşebiliyor</w:t>
+            </w:r>
+          </w:p>
+        </w:tc>
+      </w:tr>
+      <w:tr>
+        <w:tblPrEx>
+          <w:tblCellMar>
+            <w:top w:w="0" w:type="dxa"/>
+            <w:bottom w:w="0" w:type="dxa"/>
+          </w:tblCellMar>
+        </w:tblPrEx>
+        <w:tc>
+          <w:tcPr>
+            <w:tcW w:w="520" w:type="dxa"/>
+            <w:tcBorders>
+              <w:top w:val="single" w:sz="4" w:space="0" w:color="D5D9D3"/>
+              <w:left w:val="single" w:sz="4" w:space="0" w:color="D5D9D3"/>
+              <w:bottom w:val="single" w:sz="4" w:space="0" w:color="D5D9D3"/>
+              <w:right w:val="single" w:sz="4" w:space="0" w:color="D5D9D3"/>
+            </w:tcBorders>
+            <w:tcMar>
+              <w:top w:w="90" w:type="dxa"/>
+              <w:left w:w="120" w:type="dxa"/>
+              <w:bottom w:w="90" w:type="dxa"/>
+              <w:right w:w="120" w:type="dxa"/>
+            </w:tcMar>
+          </w:tcPr>
+          <w:p>
+            <w:pPr>
+              <w:jc w:val="center"/>
+            </w:pPr>
+            <w:r>
+              <w:rPr>
+                <w:rFonts w:ascii="Segoe UI Symbol" w:eastAsia="Segoe UI Symbol" w:hAnsi="Segoe UI Symbol" w:cs="Segoe UI Symbol"/>
+                <w:color w:val="0B5F56"/>
+                <w:sz w:val="24"/>
+                <w:szCs w:val="24"/>
+              </w:rPr>
+              <w:t>☑</w:t>
+            </w:r>
+          </w:p>
+        </w:tc>
+        <w:tc>
+          <w:tcPr>
+            <w:tcW w:w="5180" w:type="dxa"/>
+            <w:tcBorders>
+              <w:top w:val="single" w:sz="4" w:space="0" w:color="D5D9D3"/>
+              <w:left w:val="single" w:sz="4" w:space="0" w:color="D5D9D3"/>
+              <w:bottom w:val="single" w:sz="4" w:space="0" w:color="D5D9D3"/>
+              <w:right w:val="single" w:sz="4" w:space="0" w:color="D5D9D3"/>
+            </w:tcBorders>
+            <w:tcMar>
+              <w:top w:w="90" w:type="dxa"/>
+              <w:left w:w="120" w:type="dxa"/>
+              <w:bottom w:w="90" w:type="dxa"/>
+              <w:right w:w="120" w:type="dxa"/>
+            </w:tcMar>
+          </w:tcPr>
+          <w:p>
+            <w:r>
+              <w:rPr>
+                <w:sz w:val="19"/>
+                <w:szCs w:val="19"/>
+              </w:rPr>
+              <w:t xml:space="preserve">Uçtan uca prova: başvur → onayla → e-posta → şifre → içeri gir</w:t>
+            </w:r>
+          </w:p>
+        </w:tc>
+        <w:tc>
+          <w:tcPr>
+            <w:tcW w:w="3300" w:type="dxa"/>
+            <w:tcBorders>
+              <w:top w:val="single" w:sz="4" w:space="0" w:color="D5D9D3"/>
+              <w:left w:val="single" w:sz="4" w:space="0" w:color="D5D9D3"/>
+              <w:bottom w:val="single" w:sz="4" w:space="0" w:color="D5D9D3"/>
+              <w:right w:val="single" w:sz="4" w:space="0" w:color="D5D9D3"/>
+            </w:tcBorders>
+            <w:tcMar>
+              <w:top w:w="90" w:type="dxa"/>
+              <w:left w:w="120" w:type="dxa"/>
+              <w:bottom w:w="90" w:type="dxa"/>
+              <w:right w:w="120" w:type="dxa"/>
+            </w:tcMar>
+          </w:tcPr>
+          <w:p>
+            <w:r>
+              <w:rPr>
+                <w:color w:val="6A716A"/>
+                <w:sz w:val="17"/>
+                <w:szCs w:val="17"/>
+              </w:rPr>
+              <w:t xml:space="preserve">Zincir canlıda baştan sona yürüdü</w:t>
+            </w:r>
+          </w:p>
+        </w:tc>
+      </w:tr>
+      <w:tr>
+        <w:tblPrEx>
+          <w:tblCellMar>
+            <w:top w:w="0" w:type="dxa"/>
+            <w:bottom w:w="0" w:type="dxa"/>
+          </w:tblCellMar>
+        </w:tblPrEx>
+        <w:tc>
+          <w:tcPr>
+            <w:tcW w:w="520" w:type="dxa"/>
+            <w:tcBorders>
+              <w:top w:val="single" w:sz="4" w:space="0" w:color="D5D9D3"/>
+              <w:left w:val="single" w:sz="4" w:space="0" w:color="D5D9D3"/>
+              <w:bottom w:val="single" w:sz="4" w:space="0" w:color="D5D9D3"/>
+              <w:right w:val="single" w:sz="4" w:space="0" w:color="D5D9D3"/>
+            </w:tcBorders>
+            <w:tcMar>
+              <w:top w:w="90" w:type="dxa"/>
+              <w:left w:w="120" w:type="dxa"/>
+              <w:bottom w:w="90" w:type="dxa"/>
+              <w:right w:w="120" w:type="dxa"/>
+            </w:tcMar>
+          </w:tcPr>
+          <w:p>
+            <w:pPr>
+              <w:jc w:val="center"/>
+            </w:pPr>
+            <w:r>
+              <w:rPr>
+                <w:rFonts w:ascii="Segoe UI Symbol" w:eastAsia="Segoe UI Symbol" w:hAnsi="Segoe UI Symbol" w:cs="Segoe UI Symbol"/>
+                <w:color w:val="0B5F56"/>
+                <w:sz w:val="24"/>
+                <w:szCs w:val="24"/>
+              </w:rPr>
+              <w:t>☑</w:t>
+            </w:r>
+          </w:p>
+        </w:tc>
+        <w:tc>
+          <w:tcPr>
+            <w:tcW w:w="5180" w:type="dxa"/>
+            <w:tcBorders>
+              <w:top w:val="single" w:sz="4" w:space="0" w:color="D5D9D3"/>
+              <w:left w:val="single" w:sz="4" w:space="0" w:color="D5D9D3"/>
+              <w:bottom w:val="single" w:sz="4" w:space="0" w:color="D5D9D3"/>
+              <w:right w:val="single" w:sz="4" w:space="0" w:color="D5D9D3"/>
+            </w:tcBorders>
+            <w:tcMar>
+              <w:top w:w="90" w:type="dxa"/>
+              <w:left w:w="120" w:type="dxa"/>
+              <w:bottom w:w="90" w:type="dxa"/>
+              <w:right w:w="120" w:type="dxa"/>
+            </w:tcMar>
+          </w:tcPr>
+          <w:p>
+            <w:r>
+              <w:rPr>
+                <w:sz w:val="19"/>
+                <w:szCs w:val="19"/>
+              </w:rPr>
+              <w:t xml:space="preserve">Bu aşamanın testleri</w:t>
+            </w:r>
+          </w:p>
+        </w:tc>
+        <w:tc>
+          <w:tcPr>
+            <w:tcW w:w="3300" w:type="dxa"/>
+            <w:tcBorders>
+              <w:top w:val="single" w:sz="4" w:space="0" w:color="D5D9D3"/>
+              <w:left w:val="single" w:sz="4" w:space="0" w:color="D5D9D3"/>
+              <w:bottom w:val="single" w:sz="4" w:space="0" w:color="D5D9D3"/>
+              <w:right w:val="single" w:sz="4" w:space="0" w:color="D5D9D3"/>
+            </w:tcBorders>
+            <w:tcMar>
+              <w:top w:w="90" w:type="dxa"/>
+              <w:left w:w="120" w:type="dxa"/>
+              <w:bottom w:w="90" w:type="dxa"/>
+              <w:right w:w="120" w:type="dxa"/>
+            </w:tcMar>
+          </w:tcPr>
+          <w:p>
+            <w:r>
+              <w:rPr>
+                <w:color w:val="6A716A"/>
+                <w:sz w:val="17"/>
+                <w:szCs w:val="17"/>
+              </w:rPr>
+              <w:t xml:space="preserve">Hepsi yeşil</w:t>
+            </w:r>
+          </w:p>
+        </w:tc>
+      </w:tr>
+    </w:tbl>
+    <w:p>
+      <w:pPr>
+        <w:spacing w:after="240"/>
+      </w:pPr>
     </w:p>
     <w:p>
       <w:pPr>
@@ -15616,6 +17002,98 @@
           </w:p>
         </w:tc>
       </w:tr>
+      <w:tr>
+        <w:tblPrEx>
+          <w:tblCellMar>
+            <w:top w:w="0" w:type="dxa"/>
+            <w:bottom w:w="0" w:type="dxa"/>
+          </w:tblCellMar>
+        </w:tblPrEx>
+        <w:tc>
+          <w:tcPr>
+            <w:tcW w:w="520" w:type="dxa"/>
+            <w:tcBorders>
+              <w:top w:val="single" w:sz="4" w:space="0" w:color="D5D9D3"/>
+              <w:left w:val="single" w:sz="4" w:space="0" w:color="D5D9D3"/>
+              <w:bottom w:val="single" w:sz="4" w:space="0" w:color="D5D9D3"/>
+              <w:right w:val="single" w:sz="4" w:space="0" w:color="D5D9D3"/>
+            </w:tcBorders>
+            <w:tcMar>
+              <w:top w:w="90" w:type="dxa"/>
+              <w:left w:w="120" w:type="dxa"/>
+              <w:bottom w:w="90" w:type="dxa"/>
+              <w:right w:w="120" w:type="dxa"/>
+            </w:tcMar>
+          </w:tcPr>
+          <w:p>
+            <w:pPr>
+              <w:jc w:val="center"/>
+            </w:pPr>
+            <w:r>
+              <w:rPr>
+                <w:rFonts w:ascii="Segoe UI Symbol" w:eastAsia="Segoe UI Symbol" w:hAnsi="Segoe UI Symbol" w:cs="Segoe UI Symbol"/>
+                <w:color w:val="0B5F56"/>
+                <w:sz w:val="24"/>
+                <w:szCs w:val="24"/>
+              </w:rPr>
+              <w:t>☐</w:t>
+            </w:r>
+          </w:p>
+        </w:tc>
+        <w:tc>
+          <w:tcPr>
+            <w:tcW w:w="5180" w:type="dxa"/>
+            <w:tcBorders>
+              <w:top w:val="single" w:sz="4" w:space="0" w:color="D5D9D3"/>
+              <w:left w:val="single" w:sz="4" w:space="0" w:color="D5D9D3"/>
+              <w:bottom w:val="single" w:sz="4" w:space="0" w:color="D5D9D3"/>
+              <w:right w:val="single" w:sz="4" w:space="0" w:color="D5D9D3"/>
+            </w:tcBorders>
+            <w:tcMar>
+              <w:top w:w="90" w:type="dxa"/>
+              <w:left w:w="120" w:type="dxa"/>
+              <w:bottom w:w="90" w:type="dxa"/>
+              <w:right w:w="120" w:type="dxa"/>
+            </w:tcMar>
+          </w:tcPr>
+          <w:p>
+            <w:r>
+              <w:rPr>
+                <w:sz w:val="19"/>
+                <w:szCs w:val="19"/>
+              </w:rPr>
+              <w:t xml:space="preserve">e-İrsaliye ve muhasebe programına aktarım</w:t>
+            </w:r>
+          </w:p>
+        </w:tc>
+        <w:tc>
+          <w:tcPr>
+            <w:tcW w:w="3300" w:type="dxa"/>
+            <w:tcBorders>
+              <w:top w:val="single" w:sz="4" w:space="0" w:color="D5D9D3"/>
+              <w:left w:val="single" w:sz="4" w:space="0" w:color="D5D9D3"/>
+              <w:bottom w:val="single" w:sz="4" w:space="0" w:color="D5D9D3"/>
+              <w:right w:val="single" w:sz="4" w:space="0" w:color="D5D9D3"/>
+            </w:tcBorders>
+            <w:tcMar>
+              <w:top w:w="90" w:type="dxa"/>
+              <w:left w:w="120" w:type="dxa"/>
+              <w:bottom w:w="90" w:type="dxa"/>
+              <w:right w:w="120" w:type="dxa"/>
+            </w:tcMar>
+          </w:tcPr>
+          <w:p>
+            <w:r>
+              <w:rPr>
+                <w:color w:val="6A716A"/>
+                <w:sz w:val="17"/>
+                <w:szCs w:val="17"/>
+              </w:rPr>
+              <w:t xml:space="preserve">Sevkiyat ve fatura bilgisi müşterinin muhasebe programına aktarılabiliyor</w:t>
+            </w:r>
+          </w:p>
+        </w:tc>
+      </w:tr>
     </w:tbl>
     <w:p>
       <w:pPr>
@@ -16392,6 +17870,613 @@
     </w:tbl>
     <w:p>
       <w:pPr>
+        <w:pStyle w:val="Balk1"/>
+        <w:spacing w:before="360" w:after="160"/>
+      </w:pPr>
+      <w:r>
+        <w:rPr>
+          <w:b/>
+          <w:bCs/>
+          <w:color w:val="1B1E1B"/>
+        </w:rPr>
+        <w:t xml:space="preserve">E · Geri dönüş paneli (şikâyet ve istek)</w:t>
+      </w:r>
+    </w:p>
+    <w:p>
+      <w:pPr>
+        <w:spacing w:after="160" w:line="264" w:lineRule="auto"/>
+      </w:pPr>
+      <w:r>
+        <w:rPr>
+          <w:color w:val="6A716A"/>
+          <w:sz w:val="19"/>
+          <w:szCs w:val="19"/>
+        </w:rPr>
+        <w:t xml:space="preserve">Müşteriyi aramayacağız, e-posta beklemeyeceğiz. Müşteri geri dönüşünü kendi MİYOP oturumundan bildirecek; kayıt Evren360 yönetici panelimize düşecek. Şikâyet ile istek AYRI iki kuyruk: biri arızadır, diğeri taleptir ve ikisi aynı listede karışırsa ikisi de kaybolur. Bu panel bütün sektörlerde aynı çalışır. Emrah kararı, 2026-09-22.</w:t>
+      </w:r>
+    </w:p>
+    <w:tbl>
+      <w:tblPr>
+        <w:tblW w:w="9000" w:type="dxa"/>
+        <w:tblBorders>
+          <w:top w:val="single" w:sz="4" w:space="0" w:color="auto"/>
+          <w:left w:val="single" w:sz="4" w:space="0" w:color="auto"/>
+          <w:bottom w:val="single" w:sz="4" w:space="0" w:color="auto"/>
+          <w:right w:val="single" w:sz="4" w:space="0" w:color="auto"/>
+          <w:insideH w:val="single" w:sz="4" w:space="0" w:color="auto"/>
+          <w:insideV w:val="single" w:sz="4" w:space="0" w:color="auto"/>
+        </w:tblBorders>
+        <w:tblCellMar>
+          <w:left w:w="10" w:type="dxa"/>
+          <w:right w:w="10" w:type="dxa"/>
+        </w:tblCellMar>
+        <w:tblLook w:val="0000" w:firstRow="0" w:lastRow="0" w:firstColumn="0" w:lastColumn="0" w:noHBand="0" w:noVBand="0"/>
+      </w:tblPr>
+      <w:tblGrid>
+        <w:gridCol w:w="520"/>
+        <w:gridCol w:w="5180"/>
+        <w:gridCol w:w="3300"/>
+      </w:tblGrid>
+      <w:tr>
+        <w:tblPrEx>
+          <w:tblCellMar>
+            <w:top w:w="0" w:type="dxa"/>
+            <w:bottom w:w="0" w:type="dxa"/>
+          </w:tblCellMar>
+        </w:tblPrEx>
+        <w:trPr>
+          <w:tblHeader/>
+        </w:trPr>
+        <w:tc>
+          <w:tcPr>
+            <w:tcW w:w="520" w:type="dxa"/>
+            <w:tcBorders>
+              <w:top w:val="single" w:sz="4" w:space="0" w:color="D5D9D3"/>
+              <w:left w:val="single" w:sz="4" w:space="0" w:color="D5D9D3"/>
+              <w:bottom w:val="single" w:sz="4" w:space="0" w:color="D5D9D3"/>
+              <w:right w:val="single" w:sz="4" w:space="0" w:color="D5D9D3"/>
+            </w:tcBorders>
+            <w:shd w:val="clear" w:color="auto" w:fill="E4E8E4"/>
+            <w:tcMar>
+              <w:top w:w="90" w:type="dxa"/>
+              <w:left w:w="120" w:type="dxa"/>
+              <w:bottom w:w="90" w:type="dxa"/>
+              <w:right w:w="120" w:type="dxa"/>
+            </w:tcMar>
+          </w:tcPr>
+          <w:p/>
+        </w:tc>
+        <w:tc>
+          <w:tcPr>
+            <w:tcW w:w="5180" w:type="dxa"/>
+            <w:tcBorders>
+              <w:top w:val="single" w:sz="4" w:space="0" w:color="D5D9D3"/>
+              <w:left w:val="single" w:sz="4" w:space="0" w:color="D5D9D3"/>
+              <w:bottom w:val="single" w:sz="4" w:space="0" w:color="D5D9D3"/>
+              <w:right w:val="single" w:sz="4" w:space="0" w:color="D5D9D3"/>
+            </w:tcBorders>
+            <w:shd w:val="clear" w:color="auto" w:fill="E4E8E4"/>
+            <w:tcMar>
+              <w:top w:w="90" w:type="dxa"/>
+              <w:left w:w="120" w:type="dxa"/>
+              <w:bottom w:w="90" w:type="dxa"/>
+              <w:right w:w="120" w:type="dxa"/>
+            </w:tcMar>
+          </w:tcPr>
+          <w:p>
+            <w:r>
+              <w:rPr>
+                <w:rFonts w:ascii="Consolas" w:eastAsia="Consolas" w:hAnsi="Consolas" w:cs="Consolas"/>
+                <w:b/>
+                <w:bCs/>
+                <w:color w:val="6A716A"/>
+                <w:sz w:val="14"/>
+                <w:szCs w:val="14"/>
+              </w:rPr>
+              <w:t>GÖREV</w:t>
+            </w:r>
+          </w:p>
+        </w:tc>
+        <w:tc>
+          <w:tcPr>
+            <w:tcW w:w="3300" w:type="dxa"/>
+            <w:tcBorders>
+              <w:top w:val="single" w:sz="4" w:space="0" w:color="D5D9D3"/>
+              <w:left w:val="single" w:sz="4" w:space="0" w:color="D5D9D3"/>
+              <w:bottom w:val="single" w:sz="4" w:space="0" w:color="D5D9D3"/>
+              <w:right w:val="single" w:sz="4" w:space="0" w:color="D5D9D3"/>
+            </w:tcBorders>
+            <w:shd w:val="clear" w:color="auto" w:fill="E4E8E4"/>
+            <w:tcMar>
+              <w:top w:w="90" w:type="dxa"/>
+              <w:left w:w="120" w:type="dxa"/>
+              <w:bottom w:w="90" w:type="dxa"/>
+              <w:right w:w="120" w:type="dxa"/>
+            </w:tcMar>
+          </w:tcPr>
+          <w:p>
+            <w:r>
+              <w:rPr>
+                <w:rFonts w:ascii="Consolas" w:eastAsia="Consolas" w:hAnsi="Consolas" w:cs="Consolas"/>
+                <w:b/>
+                <w:bCs/>
+                <w:color w:val="6A716A"/>
+                <w:sz w:val="14"/>
+                <w:szCs w:val="14"/>
+              </w:rPr>
+              <w:t>BITTI SAYILIR KI…</w:t>
+            </w:r>
+          </w:p>
+        </w:tc>
+      </w:tr>
+      <w:tr>
+        <w:tblPrEx>
+          <w:tblCellMar>
+            <w:top w:w="0" w:type="dxa"/>
+            <w:bottom w:w="0" w:type="dxa"/>
+          </w:tblCellMar>
+        </w:tblPrEx>
+        <w:tc>
+          <w:tcPr>
+            <w:tcW w:w="520" w:type="dxa"/>
+            <w:tcBorders>
+              <w:top w:val="single" w:sz="4" w:space="0" w:color="D5D9D3"/>
+              <w:left w:val="single" w:sz="4" w:space="0" w:color="D5D9D3"/>
+              <w:bottom w:val="single" w:sz="4" w:space="0" w:color="D5D9D3"/>
+              <w:right w:val="single" w:sz="4" w:space="0" w:color="D5D9D3"/>
+            </w:tcBorders>
+            <w:tcMar>
+              <w:top w:w="90" w:type="dxa"/>
+              <w:left w:w="120" w:type="dxa"/>
+              <w:bottom w:w="90" w:type="dxa"/>
+              <w:right w:w="120" w:type="dxa"/>
+            </w:tcMar>
+          </w:tcPr>
+          <w:p>
+            <w:pPr>
+              <w:jc w:val="center"/>
+            </w:pPr>
+            <w:r>
+              <w:rPr>
+                <w:rFonts w:ascii="Segoe UI Symbol" w:eastAsia="Segoe UI Symbol" w:hAnsi="Segoe UI Symbol" w:cs="Segoe UI Symbol"/>
+                <w:color w:val="0B5F56"/>
+                <w:sz w:val="24"/>
+                <w:szCs w:val="24"/>
+              </w:rPr>
+              <w:t>☐</w:t>
+            </w:r>
+          </w:p>
+        </w:tc>
+        <w:tc>
+          <w:tcPr>
+            <w:tcW w:w="5180" w:type="dxa"/>
+            <w:tcBorders>
+              <w:top w:val="single" w:sz="4" w:space="0" w:color="D5D9D3"/>
+              <w:left w:val="single" w:sz="4" w:space="0" w:color="D5D9D3"/>
+              <w:bottom w:val="single" w:sz="4" w:space="0" w:color="D5D9D3"/>
+              <w:right w:val="single" w:sz="4" w:space="0" w:color="D5D9D3"/>
+            </w:tcBorders>
+            <w:tcMar>
+              <w:top w:w="90" w:type="dxa"/>
+              <w:left w:w="120" w:type="dxa"/>
+              <w:bottom w:w="90" w:type="dxa"/>
+              <w:right w:w="120" w:type="dxa"/>
+            </w:tcMar>
+          </w:tcPr>
+          <w:p>
+            <w:r>
+              <w:rPr>
+                <w:sz w:val="19"/>
+                <w:szCs w:val="19"/>
+              </w:rPr>
+              <w:t xml:space="preserve">Şikâyet kaydı (arıza bildirimi)</w:t>
+            </w:r>
+          </w:p>
+        </w:tc>
+        <w:tc>
+          <w:tcPr>
+            <w:tcW w:w="3300" w:type="dxa"/>
+            <w:tcBorders>
+              <w:top w:val="single" w:sz="4" w:space="0" w:color="D5D9D3"/>
+              <w:left w:val="single" w:sz="4" w:space="0" w:color="D5D9D3"/>
+              <w:bottom w:val="single" w:sz="4" w:space="0" w:color="D5D9D3"/>
+              <w:right w:val="single" w:sz="4" w:space="0" w:color="D5D9D3"/>
+            </w:tcBorders>
+            <w:tcMar>
+              <w:top w:w="90" w:type="dxa"/>
+              <w:left w:w="120" w:type="dxa"/>
+              <w:bottom w:w="90" w:type="dxa"/>
+              <w:right w:w="120" w:type="dxa"/>
+            </w:tcMar>
+          </w:tcPr>
+          <w:p>
+            <w:r>
+              <w:rPr>
+                <w:color w:val="6A716A"/>
+                <w:sz w:val="17"/>
+                <w:szCs w:val="17"/>
+              </w:rPr>
+              <w:t xml:space="preserve">Müşteri kendi MİYOP oturumundan bildiriyor; telefon ve e-posta gerekmiyor</w:t>
+            </w:r>
+          </w:p>
+        </w:tc>
+      </w:tr>
+      <w:tr>
+        <w:tblPrEx>
+          <w:tblCellMar>
+            <w:top w:w="0" w:type="dxa"/>
+            <w:bottom w:w="0" w:type="dxa"/>
+          </w:tblCellMar>
+        </w:tblPrEx>
+        <w:tc>
+          <w:tcPr>
+            <w:tcW w:w="520" w:type="dxa"/>
+            <w:tcBorders>
+              <w:top w:val="single" w:sz="4" w:space="0" w:color="D5D9D3"/>
+              <w:left w:val="single" w:sz="4" w:space="0" w:color="D5D9D3"/>
+              <w:bottom w:val="single" w:sz="4" w:space="0" w:color="D5D9D3"/>
+              <w:right w:val="single" w:sz="4" w:space="0" w:color="D5D9D3"/>
+            </w:tcBorders>
+            <w:tcMar>
+              <w:top w:w="90" w:type="dxa"/>
+              <w:left w:w="120" w:type="dxa"/>
+              <w:bottom w:w="90" w:type="dxa"/>
+              <w:right w:w="120" w:type="dxa"/>
+            </w:tcMar>
+          </w:tcPr>
+          <w:p>
+            <w:pPr>
+              <w:jc w:val="center"/>
+            </w:pPr>
+            <w:r>
+              <w:rPr>
+                <w:rFonts w:ascii="Segoe UI Symbol" w:eastAsia="Segoe UI Symbol" w:hAnsi="Segoe UI Symbol" w:cs="Segoe UI Symbol"/>
+                <w:color w:val="0B5F56"/>
+                <w:sz w:val="24"/>
+                <w:szCs w:val="24"/>
+              </w:rPr>
+              <w:t>☐</w:t>
+            </w:r>
+          </w:p>
+        </w:tc>
+        <w:tc>
+          <w:tcPr>
+            <w:tcW w:w="5180" w:type="dxa"/>
+            <w:tcBorders>
+              <w:top w:val="single" w:sz="4" w:space="0" w:color="D5D9D3"/>
+              <w:left w:val="single" w:sz="4" w:space="0" w:color="D5D9D3"/>
+              <w:bottom w:val="single" w:sz="4" w:space="0" w:color="D5D9D3"/>
+              <w:right w:val="single" w:sz="4" w:space="0" w:color="D5D9D3"/>
+            </w:tcBorders>
+            <w:tcMar>
+              <w:top w:w="90" w:type="dxa"/>
+              <w:left w:w="120" w:type="dxa"/>
+              <w:bottom w:w="90" w:type="dxa"/>
+              <w:right w:w="120" w:type="dxa"/>
+            </w:tcMar>
+          </w:tcPr>
+          <w:p>
+            <w:r>
+              <w:rPr>
+                <w:sz w:val="19"/>
+                <w:szCs w:val="19"/>
+              </w:rPr>
+              <w:t xml:space="preserve">İstek kaydı (yeni özellik ya da ayar talebi)</w:t>
+            </w:r>
+          </w:p>
+        </w:tc>
+        <w:tc>
+          <w:tcPr>
+            <w:tcW w:w="3300" w:type="dxa"/>
+            <w:tcBorders>
+              <w:top w:val="single" w:sz="4" w:space="0" w:color="D5D9D3"/>
+              <w:left w:val="single" w:sz="4" w:space="0" w:color="D5D9D3"/>
+              <w:bottom w:val="single" w:sz="4" w:space="0" w:color="D5D9D3"/>
+              <w:right w:val="single" w:sz="4" w:space="0" w:color="D5D9D3"/>
+            </w:tcBorders>
+            <w:tcMar>
+              <w:top w:w="90" w:type="dxa"/>
+              <w:left w:w="120" w:type="dxa"/>
+              <w:bottom w:w="90" w:type="dxa"/>
+              <w:right w:w="120" w:type="dxa"/>
+            </w:tcMar>
+          </w:tcPr>
+          <w:p>
+            <w:r>
+              <w:rPr>
+                <w:color w:val="6A716A"/>
+                <w:sz w:val="17"/>
+                <w:szCs w:val="17"/>
+              </w:rPr>
+              <w:t xml:space="preserve">Talep, şikâyetten AYRI kuyrukta duruyor</w:t>
+            </w:r>
+          </w:p>
+        </w:tc>
+      </w:tr>
+      <w:tr>
+        <w:tblPrEx>
+          <w:tblCellMar>
+            <w:top w:w="0" w:type="dxa"/>
+            <w:bottom w:w="0" w:type="dxa"/>
+          </w:tblCellMar>
+        </w:tblPrEx>
+        <w:tc>
+          <w:tcPr>
+            <w:tcW w:w="520" w:type="dxa"/>
+            <w:tcBorders>
+              <w:top w:val="single" w:sz="4" w:space="0" w:color="D5D9D3"/>
+              <w:left w:val="single" w:sz="4" w:space="0" w:color="D5D9D3"/>
+              <w:bottom w:val="single" w:sz="4" w:space="0" w:color="D5D9D3"/>
+              <w:right w:val="single" w:sz="4" w:space="0" w:color="D5D9D3"/>
+            </w:tcBorders>
+            <w:tcMar>
+              <w:top w:w="90" w:type="dxa"/>
+              <w:left w:w="120" w:type="dxa"/>
+              <w:bottom w:w="90" w:type="dxa"/>
+              <w:right w:w="120" w:type="dxa"/>
+            </w:tcMar>
+          </w:tcPr>
+          <w:p>
+            <w:pPr>
+              <w:jc w:val="center"/>
+            </w:pPr>
+            <w:r>
+              <w:rPr>
+                <w:rFonts w:ascii="Segoe UI Symbol" w:eastAsia="Segoe UI Symbol" w:hAnsi="Segoe UI Symbol" w:cs="Segoe UI Symbol"/>
+                <w:color w:val="0B5F56"/>
+                <w:sz w:val="24"/>
+                <w:szCs w:val="24"/>
+              </w:rPr>
+              <w:t>☐</w:t>
+            </w:r>
+          </w:p>
+        </w:tc>
+        <w:tc>
+          <w:tcPr>
+            <w:tcW w:w="5180" w:type="dxa"/>
+            <w:tcBorders>
+              <w:top w:val="single" w:sz="4" w:space="0" w:color="D5D9D3"/>
+              <w:left w:val="single" w:sz="4" w:space="0" w:color="D5D9D3"/>
+              <w:bottom w:val="single" w:sz="4" w:space="0" w:color="D5D9D3"/>
+              <w:right w:val="single" w:sz="4" w:space="0" w:color="D5D9D3"/>
+            </w:tcBorders>
+            <w:tcMar>
+              <w:top w:w="90" w:type="dxa"/>
+              <w:left w:w="120" w:type="dxa"/>
+              <w:bottom w:w="90" w:type="dxa"/>
+              <w:right w:w="120" w:type="dxa"/>
+            </w:tcMar>
+          </w:tcPr>
+          <w:p>
+            <w:r>
+              <w:rPr>
+                <w:sz w:val="19"/>
+                <w:szCs w:val="19"/>
+              </w:rPr>
+              <w:t xml:space="preserve">Kayıt durumu ve geçmişi append-only</w:t>
+            </w:r>
+          </w:p>
+        </w:tc>
+        <w:tc>
+          <w:tcPr>
+            <w:tcW w:w="3300" w:type="dxa"/>
+            <w:tcBorders>
+              <w:top w:val="single" w:sz="4" w:space="0" w:color="D5D9D3"/>
+              <w:left w:val="single" w:sz="4" w:space="0" w:color="D5D9D3"/>
+              <w:bottom w:val="single" w:sz="4" w:space="0" w:color="D5D9D3"/>
+              <w:right w:val="single" w:sz="4" w:space="0" w:color="D5D9D3"/>
+            </w:tcBorders>
+            <w:tcMar>
+              <w:top w:w="90" w:type="dxa"/>
+              <w:left w:w="120" w:type="dxa"/>
+              <w:bottom w:w="90" w:type="dxa"/>
+              <w:right w:w="120" w:type="dxa"/>
+            </w:tcMar>
+          </w:tcPr>
+          <w:p>
+            <w:r>
+              <w:rPr>
+                <w:color w:val="6A716A"/>
+                <w:sz w:val="17"/>
+                <w:szCs w:val="17"/>
+              </w:rPr>
+              <w:t xml:space="preserve">Açıldı → inceleniyor → çözüldü; hiçbir satır üstüne yazılmıyor</w:t>
+            </w:r>
+          </w:p>
+        </w:tc>
+      </w:tr>
+      <w:tr>
+        <w:tblPrEx>
+          <w:tblCellMar>
+            <w:top w:w="0" w:type="dxa"/>
+            <w:bottom w:w="0" w:type="dxa"/>
+          </w:tblCellMar>
+        </w:tblPrEx>
+        <w:tc>
+          <w:tcPr>
+            <w:tcW w:w="520" w:type="dxa"/>
+            <w:tcBorders>
+              <w:top w:val="single" w:sz="4" w:space="0" w:color="D5D9D3"/>
+              <w:left w:val="single" w:sz="4" w:space="0" w:color="D5D9D3"/>
+              <w:bottom w:val="single" w:sz="4" w:space="0" w:color="D5D9D3"/>
+              <w:right w:val="single" w:sz="4" w:space="0" w:color="D5D9D3"/>
+            </w:tcBorders>
+            <w:tcMar>
+              <w:top w:w="90" w:type="dxa"/>
+              <w:left w:w="120" w:type="dxa"/>
+              <w:bottom w:w="90" w:type="dxa"/>
+              <w:right w:w="120" w:type="dxa"/>
+            </w:tcMar>
+          </w:tcPr>
+          <w:p>
+            <w:pPr>
+              <w:jc w:val="center"/>
+            </w:pPr>
+            <w:r>
+              <w:rPr>
+                <w:rFonts w:ascii="Segoe UI Symbol" w:eastAsia="Segoe UI Symbol" w:hAnsi="Segoe UI Symbol" w:cs="Segoe UI Symbol"/>
+                <w:color w:val="0B5F56"/>
+                <w:sz w:val="24"/>
+                <w:szCs w:val="24"/>
+              </w:rPr>
+              <w:t>☐</w:t>
+            </w:r>
+          </w:p>
+        </w:tc>
+        <w:tc>
+          <w:tcPr>
+            <w:tcW w:w="5180" w:type="dxa"/>
+            <w:tcBorders>
+              <w:top w:val="single" w:sz="4" w:space="0" w:color="D5D9D3"/>
+              <w:left w:val="single" w:sz="4" w:space="0" w:color="D5D9D3"/>
+              <w:bottom w:val="single" w:sz="4" w:space="0" w:color="D5D9D3"/>
+              <w:right w:val="single" w:sz="4" w:space="0" w:color="D5D9D3"/>
+            </w:tcBorders>
+            <w:tcMar>
+              <w:top w:w="90" w:type="dxa"/>
+              <w:left w:w="120" w:type="dxa"/>
+              <w:bottom w:w="90" w:type="dxa"/>
+              <w:right w:w="120" w:type="dxa"/>
+            </w:tcMar>
+          </w:tcPr>
+          <w:p>
+            <w:r>
+              <w:rPr>
+                <w:sz w:val="19"/>
+                <w:szCs w:val="19"/>
+              </w:rPr>
+              <w:t xml:space="preserve">Ekran görüntüsü ve hata referansı eklenebiliyor</w:t>
+            </w:r>
+          </w:p>
+        </w:tc>
+        <w:tc>
+          <w:tcPr>
+            <w:tcW w:w="3300" w:type="dxa"/>
+            <w:tcBorders>
+              <w:top w:val="single" w:sz="4" w:space="0" w:color="D5D9D3"/>
+              <w:left w:val="single" w:sz="4" w:space="0" w:color="D5D9D3"/>
+              <w:bottom w:val="single" w:sz="4" w:space="0" w:color="D5D9D3"/>
+              <w:right w:val="single" w:sz="4" w:space="0" w:color="D5D9D3"/>
+            </w:tcBorders>
+            <w:tcMar>
+              <w:top w:w="90" w:type="dxa"/>
+              <w:left w:w="120" w:type="dxa"/>
+              <w:bottom w:w="90" w:type="dxa"/>
+              <w:right w:w="120" w:type="dxa"/>
+            </w:tcMar>
+          </w:tcPr>
+          <w:p>
+            <w:r>
+              <w:rPr>
+                <w:color w:val="6A716A"/>
+                <w:sz w:val="17"/>
+                <w:szCs w:val="17"/>
+              </w:rPr>
+              <w:t xml:space="preserve">Kayıt, müşteriye gösterilen hata referans numarasıyla eşleşiyor</w:t>
+            </w:r>
+          </w:p>
+        </w:tc>
+      </w:tr>
+      <w:tr>
+        <w:tblPrEx>
+          <w:tblCellMar>
+            <w:top w:w="0" w:type="dxa"/>
+            <w:bottom w:w="0" w:type="dxa"/>
+          </w:tblCellMar>
+        </w:tblPrEx>
+        <w:tc>
+          <w:tcPr>
+            <w:tcW w:w="520" w:type="dxa"/>
+            <w:tcBorders>
+              <w:top w:val="single" w:sz="4" w:space="0" w:color="D5D9D3"/>
+              <w:left w:val="single" w:sz="4" w:space="0" w:color="D5D9D3"/>
+              <w:bottom w:val="single" w:sz="4" w:space="0" w:color="D5D9D3"/>
+              <w:right w:val="single" w:sz="4" w:space="0" w:color="D5D9D3"/>
+            </w:tcBorders>
+            <w:tcMar>
+              <w:top w:w="90" w:type="dxa"/>
+              <w:left w:w="120" w:type="dxa"/>
+              <w:bottom w:w="90" w:type="dxa"/>
+              <w:right w:w="120" w:type="dxa"/>
+            </w:tcMar>
+          </w:tcPr>
+          <w:p>
+            <w:pPr>
+              <w:jc w:val="center"/>
+            </w:pPr>
+            <w:r>
+              <w:rPr>
+                <w:rFonts w:ascii="Segoe UI Symbol" w:eastAsia="Segoe UI Symbol" w:hAnsi="Segoe UI Symbol" w:cs="Segoe UI Symbol"/>
+                <w:color w:val="0B5F56"/>
+                <w:sz w:val="24"/>
+                <w:szCs w:val="24"/>
+              </w:rPr>
+              <w:t>☐</w:t>
+            </w:r>
+          </w:p>
+        </w:tc>
+        <w:tc>
+          <w:tcPr>
+            <w:tcW w:w="5180" w:type="dxa"/>
+            <w:tcBorders>
+              <w:top w:val="single" w:sz="4" w:space="0" w:color="D5D9D3"/>
+              <w:left w:val="single" w:sz="4" w:space="0" w:color="D5D9D3"/>
+              <w:bottom w:val="single" w:sz="4" w:space="0" w:color="D5D9D3"/>
+              <w:right w:val="single" w:sz="4" w:space="0" w:color="D5D9D3"/>
+            </w:tcBorders>
+            <w:tcMar>
+              <w:top w:w="90" w:type="dxa"/>
+              <w:left w:w="120" w:type="dxa"/>
+              <w:bottom w:w="90" w:type="dxa"/>
+              <w:right w:w="120" w:type="dxa"/>
+            </w:tcMar>
+          </w:tcPr>
+          <w:p>
+            <w:r>
+              <w:rPr>
+                <w:sz w:val="19"/>
+                <w:szCs w:val="19"/>
+              </w:rPr>
+              <w:t xml:space="preserve">Evren360 yönetici panelinde şikâyet ve istek ekranları</w:t>
+            </w:r>
+          </w:p>
+        </w:tc>
+        <w:tc>
+          <w:tcPr>
+            <w:tcW w:w="3300" w:type="dxa"/>
+            <w:tcBorders>
+              <w:top w:val="single" w:sz="4" w:space="0" w:color="D5D9D3"/>
+              <w:left w:val="single" w:sz="4" w:space="0" w:color="D5D9D3"/>
+              <w:bottom w:val="single" w:sz="4" w:space="0" w:color="D5D9D3"/>
+              <w:right w:val="single" w:sz="4" w:space="0" w:color="D5D9D3"/>
+            </w:tcBorders>
+            <w:tcMar>
+              <w:top w:w="90" w:type="dxa"/>
+              <w:left w:w="120" w:type="dxa"/>
+              <w:bottom w:w="90" w:type="dxa"/>
+              <w:right w:w="120" w:type="dxa"/>
+            </w:tcMar>
+          </w:tcPr>
+          <w:p>
+            <w:r>
+              <w:rPr>
+                <w:color w:val="6A716A"/>
+                <w:sz w:val="17"/>
+                <w:szCs w:val="17"/>
+              </w:rPr>
+              <w:t xml:space="preserve">Bütün müşteriler tek listede; aksiyon buradan alınıyor</w:t>
+            </w:r>
+          </w:p>
+        </w:tc>
+      </w:tr>
+    </w:tbl>
+    <w:p>
+      <w:pPr>
+        <w:spacing w:after="240"/>
+      </w:pPr>
+    </w:p>
+    <w:p>
+      <w:pPr>
         <w:pStyle w:val="Balk2"/>
         <w:spacing w:before="300" w:after="120"/>
       </w:pPr>
@@ -16428,7 +18513,7 @@
           <w:sz w:val="19"/>
           <w:szCs w:val="19"/>
         </w:rPr>
-        <w:t>Demo hedefi: 114 madde · 8 aşama · işaretli 52 · ayrıca demo sonrası 10 madde</w:t>
+        <w:t>Demo hedefi: 126 madde · 9 aşama · işaretli 71 · ayrıca demo sonrası 16 madde (son güncelleme 22.09.2026)</w:t>
       </w:r>
     </w:p>
     <w:sectPr>

</xml_diff>